<commit_message>
user side -> made some files for application and appointment flow, like migrations,models,seeders, and add a little snipt of code to create application in table
</commit_message>
<xml_diff>
--- a/project code help.docx
+++ b/project code help.docx
@@ -247,8 +247,165 @@
         </w:rPr>
         <w:t xml:space="preserve"> applications easy to maintain.</w:t>
       </w:r>
+    </w:p>
+    <w:p>
+      <w:pPr>
+        <w:spacing w:before="100" w:beforeAutospacing="1" w:after="100" w:afterAutospacing="1" w:line="240" w:lineRule="auto"/>
+        <w:rPr>
+          <w:rFonts w:ascii="Arial" w:eastAsia="Times New Roman" w:hAnsi="Arial" w:cs="Arial"/>
+          <w:sz w:val="20"/>
+          <w:szCs w:val="20"/>
+        </w:rPr>
+      </w:pPr>
+      <w:proofErr w:type="spellStart"/>
+      <w:proofErr w:type="gramStart"/>
+      <w:r>
+        <w:rPr>
+          <w:rFonts w:ascii="Arial" w:eastAsia="Times New Roman" w:hAnsi="Arial" w:cs="Arial"/>
+          <w:sz w:val="20"/>
+          <w:szCs w:val="20"/>
+        </w:rPr>
+        <w:t>xxxxxxxxxxxxxxxxxxxxxxxxxxxxxxxxxxxxxx</w:t>
+      </w:r>
+      <w:proofErr w:type="spellEnd"/>
+      <w:proofErr w:type="gramEnd"/>
+    </w:p>
+    <w:p>
+      <w:pPr>
+        <w:spacing w:before="100" w:beforeAutospacing="1" w:after="100" w:afterAutospacing="1" w:line="240" w:lineRule="auto"/>
+        <w:rPr>
+          <w:rFonts w:ascii="Arial" w:eastAsia="Times New Roman" w:hAnsi="Arial" w:cs="Arial"/>
+          <w:b/>
+          <w:sz w:val="20"/>
+          <w:szCs w:val="20"/>
+        </w:rPr>
+      </w:pPr>
+      <w:r>
+        <w:rPr>
+          <w:rFonts w:ascii="Arial" w:eastAsia="Times New Roman" w:hAnsi="Arial" w:cs="Arial"/>
+          <w:b/>
+          <w:sz w:val="20"/>
+          <w:szCs w:val="20"/>
+        </w:rPr>
+        <w:t>Relation between User</w:t>
+      </w:r>
+      <w:r>
+        <w:rPr>
+          <w:rFonts w:ascii="Arial" w:eastAsia="Times New Roman" w:hAnsi="Arial" w:cs="Arial"/>
+          <w:b/>
+          <w:sz w:val="20"/>
+          <w:szCs w:val="20"/>
+        </w:rPr>
+        <w:t>, Documents</w:t>
+      </w:r>
       <w:bookmarkStart w:id="0" w:name="_GoBack"/>
       <w:bookmarkEnd w:id="0"/>
+      <w:r>
+        <w:rPr>
+          <w:rFonts w:ascii="Arial" w:eastAsia="Times New Roman" w:hAnsi="Arial" w:cs="Arial"/>
+          <w:b/>
+          <w:sz w:val="20"/>
+          <w:szCs w:val="20"/>
+        </w:rPr>
+        <w:t>, Application and Appointment</w:t>
+      </w:r>
+      <w:r>
+        <w:rPr>
+          <w:rFonts w:ascii="Arial" w:eastAsia="Times New Roman" w:hAnsi="Arial" w:cs="Arial"/>
+          <w:b/>
+          <w:sz w:val="20"/>
+          <w:szCs w:val="20"/>
+        </w:rPr>
+        <w:t>:</w:t>
+      </w:r>
+    </w:p>
+    <w:p>
+      <w:pPr>
+        <w:spacing w:before="100" w:beforeAutospacing="1" w:after="100" w:afterAutospacing="1" w:line="240" w:lineRule="auto"/>
+        <w:rPr>
+          <w:rFonts w:ascii="Arial" w:eastAsia="Times New Roman" w:hAnsi="Arial" w:cs="Arial"/>
+          <w:sz w:val="20"/>
+          <w:szCs w:val="20"/>
+        </w:rPr>
+      </w:pPr>
+      <w:r>
+        <w:rPr>
+          <w:rFonts w:ascii="Arial" w:eastAsia="Times New Roman" w:hAnsi="Arial" w:cs="Arial"/>
+          <w:sz w:val="20"/>
+          <w:szCs w:val="20"/>
+        </w:rPr>
+        <w:t>User has one Application</w:t>
+      </w:r>
+      <w:r>
+        <w:rPr>
+          <w:rFonts w:ascii="Arial" w:eastAsia="Times New Roman" w:hAnsi="Arial" w:cs="Arial"/>
+          <w:sz w:val="20"/>
+          <w:szCs w:val="20"/>
+        </w:rPr>
+        <w:br/>
+        <w:t>Application belongs to User</w:t>
+      </w:r>
+    </w:p>
+    <w:p>
+      <w:pPr>
+        <w:spacing w:before="100" w:beforeAutospacing="1" w:after="100" w:afterAutospacing="1" w:line="240" w:lineRule="auto"/>
+        <w:rPr>
+          <w:rFonts w:ascii="Arial" w:eastAsia="Times New Roman" w:hAnsi="Arial" w:cs="Arial"/>
+          <w:sz w:val="20"/>
+          <w:szCs w:val="20"/>
+        </w:rPr>
+      </w:pPr>
+      <w:r>
+        <w:rPr>
+          <w:rFonts w:ascii="Arial" w:eastAsia="Times New Roman" w:hAnsi="Arial" w:cs="Arial"/>
+          <w:sz w:val="20"/>
+          <w:szCs w:val="20"/>
+        </w:rPr>
+        <w:t>Application has many Documents</w:t>
+      </w:r>
+      <w:r>
+        <w:rPr>
+          <w:rFonts w:ascii="Arial" w:eastAsia="Times New Roman" w:hAnsi="Arial" w:cs="Arial"/>
+          <w:sz w:val="20"/>
+          <w:szCs w:val="20"/>
+        </w:rPr>
+        <w:br/>
+        <w:t>Document belongs to Application</w:t>
+      </w:r>
+    </w:p>
+    <w:p>
+      <w:pPr>
+        <w:spacing w:before="100" w:beforeAutospacing="1" w:after="100" w:afterAutospacing="1" w:line="240" w:lineRule="auto"/>
+        <w:rPr>
+          <w:rFonts w:ascii="Arial" w:eastAsia="Times New Roman" w:hAnsi="Arial" w:cs="Arial"/>
+          <w:sz w:val="20"/>
+          <w:szCs w:val="20"/>
+        </w:rPr>
+      </w:pPr>
+      <w:r>
+        <w:rPr>
+          <w:rFonts w:ascii="Arial" w:eastAsia="Times New Roman" w:hAnsi="Arial" w:cs="Arial"/>
+          <w:sz w:val="20"/>
+          <w:szCs w:val="20"/>
+        </w:rPr>
+        <w:t>Application has one Appointment</w:t>
+      </w:r>
+      <w:r>
+        <w:rPr>
+          <w:rFonts w:ascii="Arial" w:eastAsia="Times New Roman" w:hAnsi="Arial" w:cs="Arial"/>
+          <w:sz w:val="20"/>
+          <w:szCs w:val="20"/>
+        </w:rPr>
+        <w:br/>
+      </w:r>
+      <w:r>
+        <w:rPr>
+          <w:rFonts w:ascii="Arial" w:eastAsia="Times New Roman" w:hAnsi="Arial" w:cs="Arial"/>
+          <w:sz w:val="20"/>
+          <w:szCs w:val="20"/>
+        </w:rPr>
+        <w:t>Appointment belongs to Application</w:t>
+      </w:r>
     </w:p>
     <w:p>
       <w:pPr>
@@ -258,6 +415,104 @@
           <w:szCs w:val="20"/>
         </w:rPr>
       </w:pPr>
+      <w:proofErr w:type="spellStart"/>
+      <w:r>
+        <w:rPr>
+          <w:rFonts w:ascii="Arial" w:hAnsi="Arial" w:cs="Arial"/>
+          <w:sz w:val="20"/>
+          <w:szCs w:val="20"/>
+        </w:rPr>
+        <w:t>Xxxxxxxxxxxxxxxxxxxxxxxxxxxxxxxxxxx</w:t>
+      </w:r>
+      <w:proofErr w:type="spellEnd"/>
+    </w:p>
+    <w:p>
+      <w:pPr>
+        <w:rPr>
+          <w:rFonts w:ascii="Arial" w:hAnsi="Arial" w:cs="Arial"/>
+          <w:b/>
+          <w:sz w:val="20"/>
+          <w:szCs w:val="20"/>
+        </w:rPr>
+      </w:pPr>
+      <w:r>
+        <w:rPr>
+          <w:rFonts w:ascii="Arial" w:hAnsi="Arial" w:cs="Arial"/>
+          <w:b/>
+          <w:sz w:val="20"/>
+          <w:szCs w:val="20"/>
+        </w:rPr>
+        <w:t>Application Table Fields:</w:t>
+      </w:r>
+    </w:p>
+    <w:p>
+      <w:proofErr w:type="spellStart"/>
+      <w:r>
+        <w:t>priority_score</w:t>
+      </w:r>
+      <w:proofErr w:type="spellEnd"/>
+      <w:r>
+        <w:t>:</w:t>
+      </w:r>
+      <w:r>
+        <w:t xml:space="preserve"> Final score calculated by your algorithm </w:t>
+      </w:r>
+      <w:r>
+        <w:br/>
+      </w:r>
+      <w:proofErr w:type="spellStart"/>
+      <w:r>
+        <w:t>submitted_at</w:t>
+      </w:r>
+      <w:proofErr w:type="spellEnd"/>
+      <w:r>
+        <w:t>:</w:t>
+      </w:r>
+      <w:r>
+        <w:t xml:space="preserve"> Time when all required documents became available </w:t>
+      </w:r>
+      <w:r>
+        <w:br/>
+      </w:r>
+      <w:proofErr w:type="spellStart"/>
+      <w:r>
+        <w:t>processing_started_at</w:t>
+      </w:r>
+      <w:proofErr w:type="spellEnd"/>
+      <w:r>
+        <w:t>:</w:t>
+      </w:r>
+      <w:r>
+        <w:t xml:space="preserve"> Time when the nightly job started processing </w:t>
+      </w:r>
+      <w:r>
+        <w:br/>
+      </w:r>
+      <w:proofErr w:type="spellStart"/>
+      <w:r>
+        <w:t>processed_at</w:t>
+      </w:r>
+      <w:proofErr w:type="spellEnd"/>
+      <w:r>
+        <w:t>:</w:t>
+      </w:r>
+      <w:r>
+        <w:t xml:space="preserve"> Time when extraction and scoring finished </w:t>
+      </w:r>
+      <w:r>
+        <w:br/>
+      </w:r>
+      <w:proofErr w:type="spellStart"/>
+      <w:r>
+        <w:t>failure_reason</w:t>
+      </w:r>
+      <w:proofErr w:type="spellEnd"/>
+      <w:r>
+        <w:t>:</w:t>
+      </w:r>
+      <w:r>
+        <w:t xml:space="preserve"> Why the application processing failed</w:t>
+      </w:r>
     </w:p>
     <w:sectPr>
       <w:pgSz w:w="12240" w:h="15840"/>

</xml_diff>